<commit_message>
Mailentwurf: Hinweis auf die fuenf Materialordner und Vergleichsuebersicht
Co-Authored-By: Claude Fable 5 <noreply@anthropic.com>
</commit_message>
<xml_diff>
--- a/Mailentwurf_Projektidee_Dittmann-Mueller.docx
+++ b/Mailentwurf_Projektidee_Dittmann-Mueller.docx
@@ -28,7 +28,7 @@
         <w:rPr>
           <w:rFonts w:ascii="Arial" w:hAnsi="Arial" w:cs="Arial"/>
         </w:rPr>
-        <w:t>Entwurf vom 09.08.2026 · Status: zum Versand vorbereitet, Anhänge: Feodor-Lynen-, Emmy-Noether- und ERC-Antragsentwurf</w:t>
+        <w:t>Entwurf vom 09.08.2026 · Status: zum Versand vorbereitet · Anhänge: Materialsysteme-Vergleich + wahlweise einzelne Antragssets aus den fünf Materialordnern</w:t>
       </w:r>
     </w:p>
     <w:p>
@@ -164,15 +164,253 @@
           <w:sz w:val="22"/>
           <w:szCs w:val="22"/>
         </w:rPr>
-        <w:t xml:space="preserve"> Ich habe diese Woche angefangen, mit Claude Code zu experimentieren, und habe die Idee testweise durch das Tool ausarbeiten lassen. Angehängt sind drei so entstandene Antragsentwürfe – </w:t>
-      </w:r>
-      <w:r>
-        <w:rPr>
-          <w:rFonts w:ascii="Arial" w:hAnsi="Arial" w:cs="Arial"/>
-          <w:sz w:val="22"/>
-          <w:szCs w:val="22"/>
-        </w:rPr>
-        <w:t xml:space="preserve">Feodor Lynen (Auslandspostdoc), Emmy Noether und ERC Starting Grant. Dabei gilt: </w:t>
+        <w:t xml:space="preserve"> Ich habe diese Woche angefangen, mit Claude Code zu experimentieren, und habe die Idee testweise durch das Tool ausarbeiten lassen – inzwischen sogar in fü</w:t>
+      </w:r>
+      <w:r>
+        <w:rPr>
+          <w:rFonts w:ascii="Arial" w:hAnsi="Arial" w:cs="Arial"/>
+          <w:sz w:val="22"/>
+          <w:szCs w:val="22"/>
+        </w:rPr>
+        <w:t>nf Varianten: Da ich mir bei der Materialwahl noch nicht sicher bin, gibt es für jedes der aus der Literaturrecherche interessanten Systeme – SrTi</w:t>
+      </w:r>
+      <w:r>
+        <w:rPr>
+          <w:rFonts w:ascii="Arial" w:hAnsi="Arial" w:cs="Arial"/>
+          <w:sz w:val="22"/>
+          <w:szCs w:val="22"/>
+          <w:vertAlign w:val="subscript"/>
+        </w:rPr>
+        <w:t>1-x</w:t>
+      </w:r>
+      <w:r>
+        <w:rPr>
+          <w:rFonts w:ascii="Arial" w:hAnsi="Arial" w:cs="Arial"/>
+          <w:sz w:val="22"/>
+          <w:szCs w:val="22"/>
+        </w:rPr>
+        <w:t>Fe</w:t>
+      </w:r>
+      <w:r>
+        <w:rPr>
+          <w:rFonts w:ascii="Arial" w:hAnsi="Arial" w:cs="Arial"/>
+          <w:sz w:val="22"/>
+          <w:szCs w:val="22"/>
+          <w:vertAlign w:val="subscript"/>
+        </w:rPr>
+        <w:t>x</w:t>
+      </w:r>
+      <w:r>
+        <w:rPr>
+          <w:rFonts w:ascii="Arial" w:hAnsi="Arial" w:cs="Arial"/>
+          <w:sz w:val="22"/>
+          <w:szCs w:val="22"/>
+        </w:rPr>
+        <w:t>O</w:t>
+      </w:r>
+      <w:r>
+        <w:rPr>
+          <w:rFonts w:ascii="Arial" w:hAnsi="Arial" w:cs="Arial"/>
+          <w:sz w:val="22"/>
+          <w:szCs w:val="22"/>
+          <w:vertAlign w:val="subscript"/>
+        </w:rPr>
+        <w:t>3-δ</w:t>
+      </w:r>
+      <w:r>
+        <w:rPr>
+          <w:rFonts w:ascii="Arial" w:hAnsi="Arial" w:cs="Arial"/>
+          <w:sz w:val="22"/>
+          <w:szCs w:val="22"/>
+        </w:rPr>
+        <w:t>, Pr</w:t>
+      </w:r>
+      <w:r>
+        <w:rPr>
+          <w:rFonts w:ascii="Arial" w:hAnsi="Arial" w:cs="Arial"/>
+          <w:sz w:val="22"/>
+          <w:szCs w:val="22"/>
+          <w:vertAlign w:val="subscript"/>
+        </w:rPr>
+        <w:t>1-x</w:t>
+      </w:r>
+      <w:r>
+        <w:rPr>
+          <w:rFonts w:ascii="Arial" w:hAnsi="Arial" w:cs="Arial"/>
+          <w:sz w:val="22"/>
+          <w:szCs w:val="22"/>
+        </w:rPr>
+        <w:t>Ca</w:t>
+      </w:r>
+      <w:r>
+        <w:rPr>
+          <w:rFonts w:ascii="Arial" w:hAnsi="Arial" w:cs="Arial"/>
+          <w:sz w:val="22"/>
+          <w:szCs w:val="22"/>
+          <w:vertAlign w:val="subscript"/>
+        </w:rPr>
+        <w:t>x</w:t>
+      </w:r>
+      <w:r>
+        <w:rPr>
+          <w:rFonts w:ascii="Arial" w:hAnsi="Arial" w:cs="Arial"/>
+          <w:sz w:val="22"/>
+          <w:szCs w:val="22"/>
+        </w:rPr>
+        <w:t>MnO</w:t>
+      </w:r>
+      <w:r>
+        <w:rPr>
+          <w:rFonts w:ascii="Arial" w:hAnsi="Arial" w:cs="Arial"/>
+          <w:sz w:val="22"/>
+          <w:szCs w:val="22"/>
+          <w:vertAlign w:val="subscript"/>
+        </w:rPr>
+        <w:t>3</w:t>
+      </w:r>
+      <w:r>
+        <w:rPr>
+          <w:rFonts w:ascii="Arial" w:hAnsi="Arial" w:cs="Arial"/>
+          <w:sz w:val="22"/>
+          <w:szCs w:val="22"/>
+        </w:rPr>
+        <w:t>, La</w:t>
+      </w:r>
+      <w:r>
+        <w:rPr>
+          <w:rFonts w:ascii="Arial" w:hAnsi="Arial" w:cs="Arial"/>
+          <w:sz w:val="22"/>
+          <w:szCs w:val="22"/>
+          <w:vertAlign w:val="subscript"/>
+        </w:rPr>
+        <w:t>1-x</w:t>
+      </w:r>
+      <w:r>
+        <w:rPr>
+          <w:rFonts w:ascii="Arial" w:hAnsi="Arial" w:cs="Arial"/>
+          <w:sz w:val="22"/>
+          <w:szCs w:val="22"/>
+        </w:rPr>
+        <w:t>Sr</w:t>
+      </w:r>
+      <w:r>
+        <w:rPr>
+          <w:rFonts w:ascii="Arial" w:hAnsi="Arial" w:cs="Arial"/>
+          <w:sz w:val="22"/>
+          <w:szCs w:val="22"/>
+          <w:vertAlign w:val="subscript"/>
+        </w:rPr>
+        <w:t>x</w:t>
+      </w:r>
+      <w:r>
+        <w:rPr>
+          <w:rFonts w:ascii="Arial" w:hAnsi="Arial" w:cs="Arial"/>
+          <w:sz w:val="22"/>
+          <w:szCs w:val="22"/>
+        </w:rPr>
+        <w:t>FeO</w:t>
+      </w:r>
+      <w:r>
+        <w:rPr>
+          <w:rFonts w:ascii="Arial" w:hAnsi="Arial" w:cs="Arial"/>
+          <w:sz w:val="22"/>
+          <w:szCs w:val="22"/>
+          <w:vertAlign w:val="subscript"/>
+        </w:rPr>
+        <w:t>3-δ</w:t>
+      </w:r>
+      <w:r>
+        <w:rPr>
+          <w:rFonts w:ascii="Arial" w:hAnsi="Arial" w:cs="Arial"/>
+          <w:sz w:val="22"/>
+          <w:szCs w:val="22"/>
+        </w:rPr>
+        <w:t>, La</w:t>
+      </w:r>
+      <w:r>
+        <w:rPr>
+          <w:rFonts w:ascii="Arial" w:hAnsi="Arial" w:cs="Arial"/>
+          <w:sz w:val="22"/>
+          <w:szCs w:val="22"/>
+          <w:vertAlign w:val="subscript"/>
+        </w:rPr>
+        <w:t>1-x</w:t>
+      </w:r>
+      <w:r>
+        <w:rPr>
+          <w:rFonts w:ascii="Arial" w:hAnsi="Arial" w:cs="Arial"/>
+          <w:sz w:val="22"/>
+          <w:szCs w:val="22"/>
+        </w:rPr>
+        <w:t>Sr</w:t>
+      </w:r>
+      <w:r>
+        <w:rPr>
+          <w:rFonts w:ascii="Arial" w:hAnsi="Arial" w:cs="Arial"/>
+          <w:sz w:val="22"/>
+          <w:szCs w:val="22"/>
+          <w:vertAlign w:val="subscript"/>
+        </w:rPr>
+        <w:t>x</w:t>
+      </w:r>
+      <w:r>
+        <w:rPr>
+          <w:rFonts w:ascii="Arial" w:hAnsi="Arial" w:cs="Arial"/>
+          <w:sz w:val="22"/>
+          <w:szCs w:val="22"/>
+        </w:rPr>
+        <w:t>MnO</w:t>
+      </w:r>
+      <w:r>
+        <w:rPr>
+          <w:rFonts w:ascii="Arial" w:hAnsi="Arial" w:cs="Arial"/>
+          <w:sz w:val="22"/>
+          <w:szCs w:val="22"/>
+          <w:vertAlign w:val="subscript"/>
+        </w:rPr>
+        <w:t>3-δ</w:t>
+      </w:r>
+      <w:r>
+        <w:rPr>
+          <w:rFonts w:ascii="Arial" w:hAnsi="Arial" w:cs="Arial"/>
+          <w:sz w:val="22"/>
+          <w:szCs w:val="22"/>
+        </w:rPr>
+        <w:t xml:space="preserve"> und La</w:t>
+      </w:r>
+      <w:r>
+        <w:rPr>
+          <w:rFonts w:ascii="Arial" w:hAnsi="Arial" w:cs="Arial"/>
+          <w:sz w:val="22"/>
+          <w:szCs w:val="22"/>
+          <w:vertAlign w:val="subscript"/>
+        </w:rPr>
+        <w:t>2</w:t>
+      </w:r>
+      <w:r>
+        <w:rPr>
+          <w:rFonts w:ascii="Arial" w:hAnsi="Arial" w:cs="Arial"/>
+          <w:sz w:val="22"/>
+          <w:szCs w:val="22"/>
+        </w:rPr>
+        <w:t>NiO</w:t>
+      </w:r>
+      <w:r>
+        <w:rPr>
+          <w:rFonts w:ascii="Arial" w:hAnsi="Arial" w:cs="Arial"/>
+          <w:sz w:val="22"/>
+          <w:szCs w:val="22"/>
+          <w:vertAlign w:val="subscript"/>
+        </w:rPr>
+        <w:t>4+δ</w:t>
+      </w:r>
+      <w:r>
+        <w:rPr>
+          <w:rFonts w:ascii="Arial" w:hAnsi="Arial" w:cs="Arial"/>
+          <w:sz w:val="22"/>
+          <w:szCs w:val="22"/>
+        </w:rPr>
+        <w:t xml:space="preserve"> – einen </w:t>
       </w:r>
       <w:r>
         <w:rPr>
@@ -182,6 +420,32 @@
           <w:sz w:val="22"/>
           <w:szCs w:val="22"/>
         </w:rPr>
+        <w:t>eigenen Ordner mit jeweils individuell angepassten Entwürfen</w:t>
+      </w:r>
+      <w:r>
+        <w:rPr>
+          <w:rFonts w:ascii="Arial" w:hAnsi="Arial" w:cs="Arial"/>
+          <w:sz w:val="22"/>
+          <w:szCs w:val="22"/>
+        </w:rPr>
+        <w:t xml:space="preserve"> für Feodor Lynen, Emmy Noether und ERC Starting Grant, dazu eine Vergleichsübersicht mit Stärken und Schwächen der fünf Systeme. Angehängt ist zunächst die Vergleichsü</w:t>
+      </w:r>
+      <w:r>
+        <w:rPr>
+          <w:rFonts w:ascii="Arial" w:hAnsi="Arial" w:cs="Arial"/>
+          <w:sz w:val="22"/>
+          <w:szCs w:val="22"/>
+        </w:rPr>
+        <w:t xml:space="preserve">bersicht; die einzelnen Antragssets schicke ich euch gerne nach, oder wir schauen sie gemeinsam durch. Dabei gilt: </w:t>
+      </w:r>
+      <w:r>
+        <w:rPr>
+          <w:rFonts w:ascii="Arial" w:hAnsi="Arial" w:cs="Arial"/>
+          <w:b/>
+          <w:bCs/>
+          <w:sz w:val="22"/>
+          <w:szCs w:val="22"/>
+        </w:rPr>
         <w:t>Nur die Projektidee selbst stammt von mir.</w:t>
       </w:r>
       <w:r>
@@ -190,58 +454,7 @@
           <w:sz w:val="22"/>
           <w:szCs w:val="22"/>
         </w:rPr>
-        <w:t xml:space="preserve"> Die gesamte Ausarbeitung – also die konkrete Materialauswahl (z. B. die La</w:t>
-      </w:r>
-      <w:r>
-        <w:rPr>
-          <w:rFonts w:ascii="Arial" w:hAnsi="Arial" w:cs="Arial"/>
-          <w:sz w:val="22"/>
-          <w:szCs w:val="22"/>
-          <w:vertAlign w:val="subscript"/>
-        </w:rPr>
-        <w:t>1-x</w:t>
-      </w:r>
-      <w:r>
-        <w:rPr>
-          <w:rFonts w:ascii="Arial" w:hAnsi="Arial" w:cs="Arial"/>
-          <w:sz w:val="22"/>
-          <w:szCs w:val="22"/>
-        </w:rPr>
-        <w:t>Sr</w:t>
-      </w:r>
-      <w:r>
-        <w:rPr>
-          <w:rFonts w:ascii="Arial" w:hAnsi="Arial" w:cs="Arial"/>
-          <w:sz w:val="22"/>
-          <w:szCs w:val="22"/>
-          <w:vertAlign w:val="subscript"/>
-        </w:rPr>
-        <w:t>x</w:t>
-      </w:r>
-      <w:r>
-        <w:rPr>
-          <w:rFonts w:ascii="Arial" w:hAnsi="Arial" w:cs="Arial"/>
-          <w:sz w:val="22"/>
-          <w:szCs w:val="22"/>
-        </w:rPr>
-        <w:t>FeO</w:t>
-      </w:r>
-      <w:r>
-        <w:rPr>
-          <w:rFonts w:ascii="Arial" w:hAnsi="Arial" w:cs="Arial"/>
-          <w:sz w:val="22"/>
-          <w:szCs w:val="22"/>
-          <w:vertAlign w:val="subscript"/>
-        </w:rPr>
-        <w:t>3-δ</w:t>
-      </w:r>
-      <w:r>
-        <w:rPr>
-          <w:rFonts w:ascii="Arial" w:hAnsi="Arial" w:cs="Arial"/>
-          <w:sz w:val="22"/>
-          <w:szCs w:val="22"/>
-        </w:rPr>
-        <w:t>-Reihe), die Literaturrecherche und deren Verknüpfung zur Argumentation, die Arbeitspakete und die Budgets – ist Claude-Code-generiert und von mir noch nicht gegengeprü</w:t>
+        <w:t xml:space="preserve"> Die gesamte Ausarbeitung – Materialauswahl und -bewertung, die Literaturrecherche und deren Verknüpfung zur Argumentation, die Arbeitspakete und die Budgets – ist Claude-Code-generiert und von mir noch nicht gegengeprü</w:t>
       </w:r>
       <w:r>
         <w:rPr>
@@ -347,6 +560,7 @@
           <w:sz w:val="22"/>
           <w:szCs w:val="22"/>
         </w:rPr>
+        <w:lastRenderedPageBreak/>
         <w:t>Viele Grüße</w:t>
       </w:r>
       <w:r>

</xml_diff>

<commit_message>
Mailentwurf: Hinweis auf abgeschlossene Referenzpruefung und erneute Literatursuche
Co-Authored-By: Claude Fable 5 <noreply@anthropic.com>
Claude-Session: https://claude.ai/code/session_01Bk7Pr8s2NdP1JMtzGzdQap
</commit_message>
<xml_diff>
--- a/Mailentwurf_Projektidee_Dittmann-Mueller.docx
+++ b/Mailentwurf_Projektidee_Dittmann-Mueller.docx
@@ -28,7 +28,7 @@
         <w:rPr>
           <w:rFonts w:ascii="Arial" w:hAnsi="Arial" w:cs="Arial"/>
         </w:rPr>
-        <w:t>Entwurf vom 09.08.2026 · Status: zum Versand vorbereitet · Anhänge: Materialsysteme-Vergleich + wahlweise einzelne Antragssets aus den fünf Materialordnern</w:t>
+        <w:t>Entwurf vom 09.08.2026 · Status: zum Versand vorbereitet · Anhänge: Materialsysteme-Vergleich + Literaturprüfung (09.08.2026) + wahlweise einzelne Antragssets aus den fünf Materialordnern</w:t>
       </w:r>
     </w:p>
     <w:p>
@@ -120,23 +120,7 @@
           <w:sz w:val="22"/>
           <w:szCs w:val="22"/>
         </w:rPr>
-        <w:t xml:space="preserve"> </w:t>
-      </w:r>
-      <w:r>
-        <w:rPr>
-          <w:rFonts w:ascii="Arial" w:hAnsi="Arial" w:cs="Arial"/>
-          <w:sz w:val="22"/>
-          <w:szCs w:val="22"/>
-        </w:rPr>
-        <w:t>In der Energieforschung ist gut etabliert, dass die Bildungsenergie von Sauerstoffleerstellen in Perowskiten von der Metall-Sauerstoff-Kovalenz kontrolliert wird und sich als Deskriptor für Materialeigenschaften nutzen lässt. In unserem Feld spielt die Leerstellen-Energetik zwar überall eine zentrale Rolle, aber meines Wissens hat noch niemand die Kovalenz systematisch als Kontrollvariable variiert und gegen die Schaltkenngrößen aufgetragen. Die Grundidee wä</w:t>
-      </w:r>
-      <w:r>
-        <w:rPr>
-          <w:rFonts w:ascii="Arial" w:hAnsi="Arial" w:cs="Arial"/>
-          <w:sz w:val="22"/>
-          <w:szCs w:val="22"/>
-        </w:rPr>
-        <w:t>re: Kovalenz in Perowskiten gezielt einstellen, per XAS quantifizieren, gegen das Schaltverhalten auftragen – und daraus langfristig eine Art „Landkarte“ bauen, die Bindungscharakter und Schaltverhalten verknüpft, ähnlich dem, was Wuttig für Chalkogenide gemacht hat.</w:t>
+        <w:t xml:space="preserve"> In der Energieforschung ist gut etabliert, dass die Bildungsenergie von Sauerstoffleerstellen in Perowskiten von der Metall-Sauerstoff-Kovalenz kontrolliert wird und sich als Deskriptor für Materialeigenschaften nutzen lässt. In unserem Feld spielt die Leerstellen-Energetik zwar überall eine zentrale Rolle, aber meines Wissens hat noch niemand die Kovalenz systematisch als Kontrollvariable variiert und gegen die Schaltkenngrößen aufgetragen. Die Grundidee wäre: Kovalenz in Perowskiten gezielt einstellen, per XAS quantifizieren, gegen das Schaltverhalten auftragen – und daraus langfristig eine Art „Landkarte“ bauen, die Bindungscharakter und Schaltverhalten verknüpft, ähnlich dem, was Wuttig für Chalkogenide gemacht hat.</w:t>
       </w:r>
     </w:p>
     <w:p>
@@ -164,15 +148,7 @@
           <w:sz w:val="22"/>
           <w:szCs w:val="22"/>
         </w:rPr>
-        <w:t xml:space="preserve"> Ich habe diese Woche angefangen, mit Claude Code zu experimentieren, und habe die Idee testweise durch das Tool ausarbeiten lassen – inzwischen sogar in fü</w:t>
-      </w:r>
-      <w:r>
-        <w:rPr>
-          <w:rFonts w:ascii="Arial" w:hAnsi="Arial" w:cs="Arial"/>
-          <w:sz w:val="22"/>
-          <w:szCs w:val="22"/>
-        </w:rPr>
-        <w:t>nf Varianten: Da ich mir bei der Materialwahl noch nicht sicher bin, gibt es für jedes der aus der Literaturrecherche interessanten Systeme – SrTi</w:t>
+        <w:t xml:space="preserve"> Ich habe diese Woche angefangen, mit Claude Code zu experimentieren, und habe die Idee testweise durch das Tool ausarbeiten lassen – inzwischen sogar in fünf Varianten: Da ich mir bei der Materialwahl noch nicht sicher bin, gibt es für jedes der aus der Literaturrecherche interessanten Systeme – SrTi</w:t>
       </w:r>
       <w:r>
         <w:rPr>
@@ -428,15 +404,7 @@
           <w:sz w:val="22"/>
           <w:szCs w:val="22"/>
         </w:rPr>
-        <w:t xml:space="preserve"> für Feodor Lynen, Emmy Noether und ERC Starting Grant, dazu eine Vergleichsübersicht mit Stärken und Schwächen der fünf Systeme. Angehängt ist zunächst die Vergleichsü</w:t>
-      </w:r>
-      <w:r>
-        <w:rPr>
-          <w:rFonts w:ascii="Arial" w:hAnsi="Arial" w:cs="Arial"/>
-          <w:sz w:val="22"/>
-          <w:szCs w:val="22"/>
-        </w:rPr>
-        <w:t xml:space="preserve">bersicht; die einzelnen Antragssets schicke ich euch gerne nach, oder wir schauen sie gemeinsam durch. Dabei gilt: </w:t>
+        <w:t xml:space="preserve"> für Feodor Lynen, Emmy Noether und ERC Starting Grant, dazu eine Vergleichsübersicht mit Stärken und Schwächen der fünf Systeme. Angehängt ist zunächst die Vergleichsübersicht; die einzelnen Antragssets schicke ich euch gerne nach, oder wir schauen sie gemeinsam durch. Dabei gilt: </w:t>
       </w:r>
       <w:r>
         <w:rPr>
@@ -454,15 +422,7 @@
           <w:sz w:val="22"/>
           <w:szCs w:val="22"/>
         </w:rPr>
-        <w:t xml:space="preserve"> Die gesamte Ausarbeitung – Materialauswahl und -bewertung, die Literaturrecherche und deren Verknüpfung zur Argumentation, die Arbeitspakete und die Budgets – ist Claude-Code-generiert und von mir noch nicht gegengeprü</w:t>
-      </w:r>
-      <w:r>
-        <w:rPr>
-          <w:rFonts w:ascii="Arial" w:hAnsi="Arial" w:cs="Arial"/>
-          <w:sz w:val="22"/>
-          <w:szCs w:val="22"/>
-        </w:rPr>
-        <w:t>ft. Behandelt die Inhalte also bitte mit entsprechender Vorsicht (insbesondere Literaturangaben und Zahlenwerte) und nagelt mich auf nichts davon fest – die Dokumente sollen nur illustrieren, wohin die Reise gehen könnte. Der Vollständigkeit halber: Auch diese Mail ist zu Teilen mit Claude Code entstanden – ihr merkt, ich teste gerade ziemlich konsequent, wo das Tool hilft und wo nicht, und bin ehrlich neugierig, was ihr von der Qualität der Ergebnisse haltet.</w:t>
+        <w:t xml:space="preserve"> Die gesamte Ausarbeitung – Materialauswahl und -bewertung, die Literaturrecherche und deren Verknüpfung zur Argumentation, die Arbeitspakete und die Budgets – ist Claude-Code-generiert. Immerhin: Inzwischen habe ich das Tool alle 101 Literaturverweise des Portfolios systematisch gegen die Verlagsangaben prüfen lassen – dabei kamen tatsächlich Fehler zum Vorschein (u. a. fünf falsche Erstautoren und ein erfundener Titel), die inzwischen in allen Dokumenten korrigiert sind; auch die systematische Literatursuche je Materialsystem wurde erneut durchgeführt, und die zentralen „Lücken“-Argumente der fünf Systeme haben dabei gehalten (Details im angehängten Prüfdokument Literaturpruefung_2026-08-09). Von mir persönlich gegengeprüft ist der Inhalt aber weiterhin nicht – behandelt insbesondere Zahlenwerte und die inhaltlichen Bewertungen also bitte mit entsprechender Vorsicht und nagelt mich auf nichts davon fest – die Dokumente sollen nur illustrieren, wohin die Reise gehen könnte. Der Vollständigkeit halber: Auch diese Mail ist zu Teilen mit Claude Code entstanden – ihr merkt, ich teste gerade ziemlich konsequent, wo das Tool hilft und wo nicht, und bin ehrlich neugierig, was ihr von der Qualität der Ergebnisse haltet.</w:t>
       </w:r>
     </w:p>
     <w:p>
@@ -480,15 +440,7 @@
           <w:sz w:val="22"/>
           <w:szCs w:val="22"/>
         </w:rPr>
-        <w:t xml:space="preserve">Ein Beispiel dafür: Das Lynen-Exposé </w:t>
-      </w:r>
-      <w:r>
-        <w:rPr>
-          <w:rFonts w:ascii="Arial" w:hAnsi="Arial" w:cs="Arial"/>
-          <w:sz w:val="22"/>
-          <w:szCs w:val="22"/>
-        </w:rPr>
-        <w:t>hat Claude Code auf die Chueh-Gruppe in Stanford zugeschnitten (Vorschlag des Tools nach Abgleich von Themenpassung und Humboldt-Gastgeberkriterien). David, du warst ja dort und kennst Gruppe und Umfeld aus erster Hand – von außen schienen die experimentellen Möglichkeiten (Defektchemie, direkter SSRL-Zugang für XAS) gut zu passen. Ob das aus deiner Innensicht stimmt, wäre für mich eine der wertvollsten Rückmeldungen überhaupt. Genauso interessiert mich deine Meinung zur XAS-Seite der Idee generell.</w:t>
+        <w:t xml:space="preserve">Ein Beispiel dafür: Das Lynen-Exposé hat Claude Code auf die Chueh-Gruppe in Stanford zugeschnitten (Vorschlag des Tools nach Abgleich von Themenpassung und Humboldt-Gastgeberkriterien). David, du warst ja dort und kennst Gruppe und Umfeld aus erster Hand – von außen schienen die experimentellen Möglichkeiten (Defektchemie, direkter SSRL-Zugang für XAS) gut zu passen. Ob das aus deiner Innensicht stimmt, wäre für mich eine der wertvollsten Rückmeldungen überhaupt. Genauso interessiert mich deine Meinung zur XAS-Seite der Idee generell.</w:t>
       </w:r>
     </w:p>
     <w:p>
@@ -534,15 +486,7 @@
           <w:sz w:val="22"/>
           <w:szCs w:val="22"/>
         </w:rPr>
-        <w:t xml:space="preserve">Am liebsten würde ich dazu in den nächsten Wochen mal eine halbe Stunde mit euch zusammensitzen – </w:t>
-      </w:r>
-      <w:r>
-        <w:rPr>
-          <w:rFonts w:ascii="Arial" w:hAnsi="Arial" w:cs="Arial"/>
-          <w:sz w:val="22"/>
-          <w:szCs w:val="22"/>
-        </w:rPr>
-        <w:t>ganz unverbindlich, mir geht es erst einmal darum, ob ihr es für sinnvoll haltet, dass ich das weiterverfolge.</w:t>
+        <w:t xml:space="preserve">Am liebsten würde ich dazu in den nächsten Wochen mal eine halbe Stunde mit euch zusammensitzen – ganz unverbindlich, mir geht es erst einmal darum, ob ihr es für sinnvoll haltet, dass ich das weiterverfolge.</w:t>
       </w:r>
     </w:p>
     <w:p>
@@ -562,13 +506,6 @@
         </w:rPr>
         <w:lastRenderedPageBreak/>
         <w:t>Viele Grüße</w:t>
-      </w:r>
-      <w:r>
-        <w:rPr>
-          <w:rFonts w:ascii="Arial" w:hAnsi="Arial" w:cs="Arial"/>
-          <w:sz w:val="22"/>
-          <w:szCs w:val="22"/>
-        </w:rPr>
         <w:br/>
         <w:t>Max</w:t>
       </w:r>

</xml_diff>

<commit_message>
Mailentwurf: Screening-Anhang und Drei-Kriterien-Logik ergaenzt
Co-Authored-By: Claude Fable 5 <noreply@anthropic.com>
Claude-Session: https://claude.ai/code/session_01Bk7Pr8s2NdP1JMtzGzdQap
</commit_message>
<xml_diff>
--- a/Mailentwurf_Projektidee_Dittmann-Mueller.docx
+++ b/Mailentwurf_Projektidee_Dittmann-Mueller.docx
@@ -28,7 +28,13 @@
         <w:rPr>
           <w:rFonts w:ascii="Arial" w:hAnsi="Arial" w:cs="Arial"/>
         </w:rPr>
-        <w:t>Entwurf vom 09.08.2026 · Status: zum Versand vorbereitet · Anhänge: Materialsysteme-Vergleich + Literaturprüfung (09.08.2026) + wahlweise einzelne Antragssets aus den sechs Materialordnern</w:t>
+        <w:t xml:space="preserve">Entwurf vom 09.08.2026 · Status: zum Versand vorbereitet · </w:t>
+      </w:r>
+      <w:r>
+        <w:rPr>
+          <w:rFonts w:ascii="Arial" w:hAnsi="Arial" w:cs="Arial"/>
+        </w:rPr>
+        <w:t xml:space="preserve">Anhänge: Materialsysteme-Vergleich + Literaturprüfung (09.08.2026) + Materialscreening (09.08.2026) + wahlweise einzelne Antragssets aus den sechs Materialordnern</w:t>
       </w:r>
     </w:p>
     <w:p>
@@ -353,7 +359,23 @@
           <w:sz w:val="22"/>
           <w:szCs w:val="22"/>
         </w:rPr>
-        <w:t xml:space="preserve"> Die gesamte Ausarbeitung – Materialauswahl und -bewertung, die Literaturrecherche und deren Verknüpfung zur Argumentation, die Arbeitspakete und die Budgets – ist Claude-Code-generiert. Immerhin: Inzwischen habe ich das Tool alle 101 Literaturverweise des Portfolios systematisch gegen die Verlagsangaben prüfen lassen – dabei kamen tatsächlich Fehler zum Vorschein (u. a. fünf falsche Erstautoren und ein erfundener Titel), die inzwischen in allen Dokumenten korrigiert sind; auch die systematische Literatursuche je Materialsystem wurde erneut durchgeführt, und die zentralen „Lücken“-Argumente der fünf Systeme haben dabei gehalten (Details im angehängten Prüfdokument Literaturpruefung_2026-08-09). Von mir persönlich gegengeprüft ist der Inhalt aber weiterhin nicht – behandelt insbesondere Zahlenwerte und die inhaltlichen Bewertungen also bitte mit entsprechender Vorsicht und nagelt mich auf nichts davon fest – die Dokumente sollen nur illustrieren, wohin die Reise gehen könnte. Der Vollständigkeit halber: Auch diese Mail ist zu Teilen mit Claude Code entstanden – ihr merkt, ich teste gerade ziemlich konsequent, wo das Tool hilft und wo nicht, und bin ehrlich neugierig, was ihr von der Qualität der Ergebnisse haltet.</w:t>
+        <w:t xml:space="preserve"> Die gesamte Ausarbeitung – Materialauswahl und -bewertung, die Literaturrecherche und deren Verknüpfung zur Argumentation, die Arbeitspakete und die Budgets – ist Claude-Code-generiert. Immerhin: Inzwischen habe ich das Tool alle 101 Literaturverweise des Portfolios systematisch gegen die Verlagsangaben prüfen lassen – dabei kamen tatsächlich Fehler zum Vorschein (u. a. fünf falsche Erstautoren und ein erfundener Titel), die inzwischen in allen Dokumenten korrigiert sind; auch die systematische Literatursuche je Materialsystem wurde erneut durchgeführt, und </w:t>
+      </w:r>
+      <w:r>
+        <w:rPr>
+          <w:rFonts w:ascii="Arial" w:hAnsi="Arial" w:cs="Arial"/>
+          <w:sz w:val="22"/>
+          <w:szCs w:val="22"/>
+        </w:rPr>
+        <w:t xml:space="preserve">die zentralen „Lücken“-Argumente der damals fünf Systeme haben dabei gehalten (Details im angehängten Prüfdokument Literaturpruefung_2026-08-09). Zuletzt habe ich die Materialauswahl auf eine explizite Drei-Kriterien-Logik umgestellt (Kovalenzänderung mit der Stöchiometrie belegt? EV-Änderung mit der Kovalenz belegt? Schaltnachweis an einer Edelmetall-Grenzfläche?) und das Tool damit ein Familien-Screening über die Oxidklassen rechnen lassen – Ergebnis im angehängten Screening-Dokument; daraus stammen die drei neuen Ordner, und die ERC-/Emmy-Noether-Fassungen benennen seither sogar vorgeprüfte Blind-Validierungskandidaten für die „Landkarten“-Idee (YBa2Cu3O7-δ mit etablierter Au/Au-Plattform und Gd-dotiertes CeO2 auf publizierter Pt/Pt-Crossbar-Basis).</w:t>
+      </w:r>
+      <w:r>
+        <w:rPr>
+          <w:rFonts w:ascii="Arial" w:hAnsi="Arial" w:cs="Arial"/>
+          <w:sz w:val="22"/>
+          <w:szCs w:val="22"/>
+        </w:rPr>
+        <w:t xml:space="preserve"> Von mir persönlich gegengeprüft ist der Inhalt aber weiterhin nicht – behandelt insbesondere Zahlenwerte und die inhaltlichen Bewertungen also bitte mit entsprechender Vorsicht und nagelt mich auf nichts davon fest – die Dokumente sollen nur illustrieren, wohin die Reise gehen könnte. Der Vollständigkeit halber: Auch diese Mail ist zu Teilen mit Claude Code entstanden – ihr merkt, ich teste gerade ziemlich konsequent, wo das Tool hilft und wo nicht, und bin ehrlich neugierig, was ihr von der Qualität der Ergebnisse haltet.</w:t>
       </w:r>
     </w:p>
     <w:p>

</xml_diff>

<commit_message>
Mailentwurf kompaktiert: nur Endstand statt Entwicklungsgeschichte
Der lange Prozess-Absatz (fuenf Systeme, Ausschluss, Screening-Historie,
Verifikations-Chronologie) ist durch eine kompakte Endstands-Beschreibung
ersetzt: sechs Materialsysteme mit komplettem Antragsset, Drei-Kriterien-
Beleglogik, verifizierte Referenzen, Blind-Validierungskandidaten.
KI-Disclosure und Vorsichts-Hinweis bleiben erhalten.

Co-Authored-By: Claude Fable 5 <noreply@anthropic.com>
Claude-Session: https://claude.ai/code/session_01Bk7Pr8s2NdP1JMtzGzdQap
</commit_message>
<xml_diff>
--- a/Mailentwurf_Projektidee_Dittmann-Mueller.docx
+++ b/Mailentwurf_Projektidee_Dittmann-Mueller.docx
@@ -146,121 +146,159 @@
           <w:sz w:val="22"/>
           <w:szCs w:val="22"/>
         </w:rPr>
-        <w:t>Wichtig zur Einordnung der Anhänge:</w:t>
-      </w:r>
-      <w:r>
-        <w:rPr>
-          <w:rFonts w:ascii="Arial" w:hAnsi="Arial" w:cs="Arial"/>
-          <w:sz w:val="22"/>
-          <w:szCs w:val="22"/>
-        </w:rPr>
-        <w:t xml:space="preserve"> Ich habe diese Woche angefangen, mit Claude Code zu experimentieren, und habe die Idee testweise durch das Tool ausarbeiten lassen – inzwischen sogar in mehreren Varianten: Da ich mir bei der Materialwahl noch nicht sicher bin, gibt es für jedes der aus der Literaturrecherche interessanten Systeme – SrTi</w:t>
-      </w:r>
-      <w:r>
-        <w:rPr>
-          <w:rFonts w:ascii="Arial" w:hAnsi="Arial" w:cs="Arial"/>
-          <w:sz w:val="22"/>
-          <w:szCs w:val="22"/>
-          <w:vertAlign w:val="subscript"/>
-        </w:rPr>
-        <w:t>1-x</w:t>
-      </w:r>
-      <w:r>
-        <w:rPr>
-          <w:rFonts w:ascii="Arial" w:hAnsi="Arial" w:cs="Arial"/>
-          <w:sz w:val="22"/>
-          <w:szCs w:val="22"/>
-        </w:rPr>
-        <w:t>Fe</w:t>
-      </w:r>
-      <w:r>
-        <w:rPr>
-          <w:rFonts w:ascii="Arial" w:hAnsi="Arial" w:cs="Arial"/>
-          <w:sz w:val="22"/>
-          <w:szCs w:val="22"/>
-          <w:vertAlign w:val="subscript"/>
-        </w:rPr>
-        <w:t>x</w:t>
-      </w:r>
-      <w:r>
-        <w:rPr>
-          <w:rFonts w:ascii="Arial" w:hAnsi="Arial" w:cs="Arial"/>
-          <w:sz w:val="22"/>
-          <w:szCs w:val="22"/>
-        </w:rPr>
-        <w:t>O</w:t>
-      </w:r>
-      <w:r>
-        <w:rPr>
-          <w:rFonts w:ascii="Arial" w:hAnsi="Arial" w:cs="Arial"/>
-          <w:sz w:val="22"/>
-          <w:szCs w:val="22"/>
-          <w:vertAlign w:val="subscript"/>
-        </w:rPr>
-        <w:t>3-δ</w:t>
-      </w:r>
-      <w:r>
-        <w:rPr>
-          <w:rFonts w:ascii="Arial" w:hAnsi="Arial" w:cs="Arial"/>
-          <w:sz w:val="22"/>
-          <w:szCs w:val="22"/>
-        </w:rPr>
-        <w:t>, Pr</w:t>
-      </w:r>
-      <w:r>
-        <w:rPr>
-          <w:rFonts w:ascii="Arial" w:hAnsi="Arial" w:cs="Arial"/>
-          <w:sz w:val="22"/>
-          <w:szCs w:val="22"/>
-          <w:vertAlign w:val="subscript"/>
-        </w:rPr>
-        <w:t>1-x</w:t>
-      </w:r>
-      <w:r>
-        <w:rPr>
-          <w:rFonts w:ascii="Arial" w:hAnsi="Arial" w:cs="Arial"/>
-          <w:sz w:val="22"/>
-          <w:szCs w:val="22"/>
-        </w:rPr>
-        <w:t>Ca</w:t>
-      </w:r>
-      <w:r>
-        <w:rPr>
-          <w:rFonts w:ascii="Arial" w:hAnsi="Arial" w:cs="Arial"/>
-          <w:sz w:val="22"/>
-          <w:szCs w:val="22"/>
-          <w:vertAlign w:val="subscript"/>
-        </w:rPr>
-        <w:t>x</w:t>
-      </w:r>
-      <w:r>
-        <w:rPr>
-          <w:rFonts w:ascii="Arial" w:hAnsi="Arial" w:cs="Arial"/>
-          <w:sz w:val="22"/>
-          <w:szCs w:val="22"/>
-        </w:rPr>
-        <w:t>MnO</w:t>
-      </w:r>
-      <w:r>
-        <w:rPr>
-          <w:rFonts w:ascii="Arial" w:hAnsi="Arial" w:cs="Arial"/>
-          <w:sz w:val="22"/>
-          <w:szCs w:val="22"/>
-          <w:vertAlign w:val="subscript"/>
-        </w:rPr>
-        <w:t>3</w:t>
-      </w:r>
-      <w:r>
-        <w:rPr>
-          <w:rFonts w:ascii="Arial" w:hAnsi="Arial" w:cs="Arial"/>
-          <w:sz w:val="22"/>
-          <w:szCs w:val="22"/>
-        </w:rPr>
-        <w:t xml:space="preserve"> und </w:t>
-      </w:r>
-      <w:r>
-        <w:rPr>
-          <w:rFonts w:ascii="Arial" w:hAnsi="Arial" w:cs="Arial"/>
+        <w:t xml:space="preserve">Wichtig zur Einordnung der Anhänge: Nur die Projektidee selbst stammt von mir – die gesamte Ausarbeitung ist mit Claude Code entstanden (auch diese Mail in Teilen); ich teste gerade konsequent, wo das Tool hilft, und bin ehrlich neugierig, was ihr von der Qualität der Ergebnisse haltet. Der Stand: sechs Materialsysteme – </w:t>
+      </w:r>
+      <w:r>
+        <w:rPr>
+          <w:rFonts w:ascii="Arial" w:hAnsi="Arial" w:cs="Arial"/>
+          <w:b/>
+          <w:bCs/>
+          <w:sz w:val="22"/>
+          <w:szCs w:val="22"/>
+        </w:rPr>
+        <w:t xml:space="preserve">SrTi</w:t>
+      </w:r>
+      <w:r>
+        <w:rPr>
+          <w:rFonts w:ascii="Arial" w:hAnsi="Arial" w:cs="Arial"/>
+          <w:b/>
+          <w:bCs/>
+          <w:sz w:val="22"/>
+          <w:szCs w:val="22"/>
+          <w:vertAlign w:val="subscript"/>
+        </w:rPr>
+        <w:t xml:space="preserve">1-x</w:t>
+      </w:r>
+      <w:r>
+        <w:rPr>
+          <w:rFonts w:ascii="Arial" w:hAnsi="Arial" w:cs="Arial"/>
+          <w:b/>
+          <w:bCs/>
+          <w:sz w:val="22"/>
+          <w:szCs w:val="22"/>
+        </w:rPr>
+        <w:t xml:space="preserve">Fe</w:t>
+      </w:r>
+      <w:r>
+        <w:rPr>
+          <w:rFonts w:ascii="Arial" w:hAnsi="Arial" w:cs="Arial"/>
+          <w:b/>
+          <w:bCs/>
+          <w:sz w:val="22"/>
+          <w:szCs w:val="22"/>
+          <w:vertAlign w:val="subscript"/>
+        </w:rPr>
+        <w:t xml:space="preserve">x</w:t>
+      </w:r>
+      <w:r>
+        <w:rPr>
+          <w:rFonts w:ascii="Arial" w:hAnsi="Arial" w:cs="Arial"/>
+          <w:b/>
+          <w:bCs/>
+          <w:sz w:val="22"/>
+          <w:szCs w:val="22"/>
+        </w:rPr>
+        <w:t xml:space="preserve">O</w:t>
+      </w:r>
+      <w:r>
+        <w:rPr>
+          <w:rFonts w:ascii="Arial" w:hAnsi="Arial" w:cs="Arial"/>
+          <w:b/>
+          <w:bCs/>
+          <w:sz w:val="22"/>
+          <w:szCs w:val="22"/>
+          <w:vertAlign w:val="subscript"/>
+        </w:rPr>
+        <w:t xml:space="preserve">3-δ</w:t>
+      </w:r>
+      <w:r>
+        <w:rPr>
+          <w:rFonts w:ascii="Arial" w:hAnsi="Arial" w:cs="Arial"/>
+          <w:b/>
+          <w:bCs/>
+          <w:sz w:val="22"/>
+          <w:szCs w:val="22"/>
+        </w:rPr>
+        <w:t xml:space="preserve">, </w:t>
+      </w:r>
+      <w:r>
+        <w:rPr>
+          <w:rFonts w:ascii="Arial" w:hAnsi="Arial" w:cs="Arial"/>
+          <w:b/>
+          <w:bCs/>
+          <w:sz w:val="22"/>
+          <w:szCs w:val="22"/>
+        </w:rPr>
+        <w:t xml:space="preserve">Pr</w:t>
+      </w:r>
+      <w:r>
+        <w:rPr>
+          <w:rFonts w:ascii="Arial" w:hAnsi="Arial" w:cs="Arial"/>
+          <w:b/>
+          <w:bCs/>
+          <w:sz w:val="22"/>
+          <w:szCs w:val="22"/>
+          <w:vertAlign w:val="subscript"/>
+        </w:rPr>
+        <w:t xml:space="preserve">1-x</w:t>
+      </w:r>
+      <w:r>
+        <w:rPr>
+          <w:rFonts w:ascii="Arial" w:hAnsi="Arial" w:cs="Arial"/>
+          <w:b/>
+          <w:bCs/>
+          <w:sz w:val="22"/>
+          <w:szCs w:val="22"/>
+        </w:rPr>
+        <w:t xml:space="preserve">Ca</w:t>
+      </w:r>
+      <w:r>
+        <w:rPr>
+          <w:rFonts w:ascii="Arial" w:hAnsi="Arial" w:cs="Arial"/>
+          <w:b/>
+          <w:bCs/>
+          <w:sz w:val="22"/>
+          <w:szCs w:val="22"/>
+          <w:vertAlign w:val="subscript"/>
+        </w:rPr>
+        <w:t xml:space="preserve">x</w:t>
+      </w:r>
+      <w:r>
+        <w:rPr>
+          <w:rFonts w:ascii="Arial" w:hAnsi="Arial" w:cs="Arial"/>
+          <w:b/>
+          <w:bCs/>
+          <w:sz w:val="22"/>
+          <w:szCs w:val="22"/>
+        </w:rPr>
+        <w:t xml:space="preserve">MnO</w:t>
+      </w:r>
+      <w:r>
+        <w:rPr>
+          <w:rFonts w:ascii="Arial" w:hAnsi="Arial" w:cs="Arial"/>
+          <w:b/>
+          <w:bCs/>
+          <w:sz w:val="22"/>
+          <w:szCs w:val="22"/>
+          <w:vertAlign w:val="subscript"/>
+        </w:rPr>
+        <w:t xml:space="preserve">3</w:t>
+      </w:r>
+      <w:r>
+        <w:rPr>
+          <w:rFonts w:ascii="Arial" w:hAnsi="Arial" w:cs="Arial"/>
+          <w:b/>
+          <w:bCs/>
+          <w:sz w:val="22"/>
+          <w:szCs w:val="22"/>
+        </w:rPr>
+        <w:t xml:space="preserve">, </w:t>
+      </w:r>
+      <w:r>
+        <w:rPr>
+          <w:rFonts w:ascii="Arial" w:hAnsi="Arial" w:cs="Arial"/>
+          <w:b/>
+          <w:bCs/>
           <w:sz w:val="22"/>
           <w:szCs w:val="22"/>
         </w:rPr>
@@ -269,6 +307,8 @@
       <w:r>
         <w:rPr>
           <w:rFonts w:ascii="Arial" w:hAnsi="Arial" w:cs="Arial"/>
+          <w:b/>
+          <w:bCs/>
           <w:sz w:val="22"/>
           <w:szCs w:val="22"/>
           <w:vertAlign w:val="subscript"/>
@@ -278,6 +318,8 @@
       <w:r>
         <w:rPr>
           <w:rFonts w:ascii="Arial" w:hAnsi="Arial" w:cs="Arial"/>
+          <w:b/>
+          <w:bCs/>
           <w:sz w:val="22"/>
           <w:szCs w:val="22"/>
         </w:rPr>
@@ -286,6 +328,8 @@
       <w:r>
         <w:rPr>
           <w:rFonts w:ascii="Arial" w:hAnsi="Arial" w:cs="Arial"/>
+          <w:b/>
+          <w:bCs/>
           <w:sz w:val="22"/>
           <w:szCs w:val="22"/>
           <w:vertAlign w:val="subscript"/>
@@ -295,6 +339,8 @@
       <w:r>
         <w:rPr>
           <w:rFonts w:ascii="Arial" w:hAnsi="Arial" w:cs="Arial"/>
+          <w:b/>
+          <w:bCs/>
           <w:sz w:val="22"/>
           <w:szCs w:val="22"/>
         </w:rPr>
@@ -303,6 +349,8 @@
       <w:r>
         <w:rPr>
           <w:rFonts w:ascii="Arial" w:hAnsi="Arial" w:cs="Arial"/>
+          <w:b/>
+          <w:bCs/>
           <w:sz w:val="22"/>
           <w:szCs w:val="22"/>
           <w:vertAlign w:val="subscript"/>
@@ -312,70 +360,220 @@
       <w:r>
         <w:rPr>
           <w:rFonts w:ascii="Arial" w:hAnsi="Arial" w:cs="Arial"/>
-          <w:sz w:val="22"/>
-          <w:szCs w:val="22"/>
-        </w:rPr>
-        <w:t xml:space="preserve"> –</w:t>
-      </w:r>
-      <w:r>
-        <w:rPr>
-          <w:rFonts w:ascii="Arial" w:hAnsi="Arial" w:cs="Arial"/>
-          <w:sz w:val="22"/>
-          <w:szCs w:val="22"/>
-        </w:rPr>
-        <w:t xml:space="preserve"> einen </w:t>
-      </w:r>
-      <w:r>
-        <w:rPr>
-          <w:rFonts w:ascii="Arial" w:hAnsi="Arial" w:cs="Arial"/>
-          <w:b/>
-          <w:bCs/>
-          <w:sz w:val="22"/>
-          <w:szCs w:val="22"/>
-        </w:rPr>
-        <w:t>eigenen Ordner mit jeweils individuell angepassten Entwürfen</w:t>
-      </w:r>
-      <w:r>
-        <w:rPr>
-          <w:rFonts w:ascii="Arial" w:hAnsi="Arial" w:cs="Arial"/>
-          <w:sz w:val="22"/>
-          <w:szCs w:val="22"/>
-        </w:rPr>
-        <w:t xml:space="preserve"> für Feodor Lynen, Emmy Noether und ERC Starting Grant, dazu eine Vergleichsübersicht mit Stärken und Schwächen der Systeme (ursprünglich fünf; zwei – La1-xSrxMnO3 und La2NiO4 – wurden nach der Beleglage-Prüfung mangels Edelmetall-Schaltnachweis wieder ausgeschieden, und drei im anschließenden Kriterien-Screening identifizierte Systeme – La1-xSrxCoO3-δ mit SrCoOx-Anker, YBa2Cu3O7-δ und Gd-dotiertes CeO2 – sind als Ordner 6–8 neu hinzugekommen). Angehängt ist zunächst die Vergleichsübersicht; die einzelnen Antragssets schicke ich euch gerne nach, oder wir schauen sie gemeinsam durch. Dabei gilt: </w:t>
-      </w:r>
-      <w:r>
-        <w:rPr>
-          <w:rFonts w:ascii="Arial" w:hAnsi="Arial" w:cs="Arial"/>
-          <w:b/>
-          <w:bCs/>
-          <w:sz w:val="22"/>
-          <w:szCs w:val="22"/>
-        </w:rPr>
-        <w:t>Nur die Projektidee selbst stammt von mir.</w:t>
-      </w:r>
-      <w:r>
-        <w:rPr>
-          <w:rFonts w:ascii="Arial" w:hAnsi="Arial" w:cs="Arial"/>
-          <w:sz w:val="22"/>
-          <w:szCs w:val="22"/>
-        </w:rPr>
-        <w:t xml:space="preserve"> Die gesamte Ausarbeitung – Materialauswahl und -bewertung, die Literaturrecherche und deren Verknüpfung zur Argumentation, die Arbeitspakete und die Budgets – ist Claude-Code-generiert. Immerhin: Inzwischen habe ich das Tool alle 101 Literaturverweise des Portfolios systematisch gegen die Verlagsangaben prüfen lassen – dabei kamen tatsächlich Fehler zum Vorschein (u. a. fünf falsche Erstautoren und ein erfundener Titel), die inzwischen in allen Dokumenten korrigiert sind; auch die systematische Literatursuche je Materialsystem wurde erneut durchgeführt, und </w:t>
-      </w:r>
-      <w:r>
-        <w:rPr>
-          <w:rFonts w:ascii="Arial" w:hAnsi="Arial" w:cs="Arial"/>
-          <w:sz w:val="22"/>
-          <w:szCs w:val="22"/>
-        </w:rPr>
-        <w:t xml:space="preserve">die zentralen „Lücken“-Argumente der damals fünf Systeme haben dabei gehalten (Details im angehängten Prüfdokument Literaturpruefung_2026-08-09). Zuletzt habe ich die Materialauswahl auf eine explizite Drei-Kriterien-Logik umgestellt (Kovalenzänderung mit der Stöchiometrie belegt? EV-Änderung mit der Kovalenz belegt? Schaltnachweis an einer Edelmetall-Grenzfläche?) und das Tool damit ein Familien-Screening über die Oxidklassen rechnen lassen – Ergebnis im angehängten Screening-Dokument; daraus stammen die drei neuen Ordner, und die ERC-/Emmy-Noether-Fassungen benennen seither sogar vorgeprüfte Blind-Validierungskandidaten für die „Landkarten“-Idee (YBa2Cu3O7-δ mit etablierter Au/Au-Plattform und Gd-dotiertes CeO2 auf publizierter Pt/Pt-Crossbar-Basis).</w:t>
-      </w:r>
-      <w:r>
-        <w:rPr>
-          <w:rFonts w:ascii="Arial" w:hAnsi="Arial" w:cs="Arial"/>
-          <w:sz w:val="22"/>
-          <w:szCs w:val="22"/>
-        </w:rPr>
-        <w:t xml:space="preserve"> Von mir persönlich gegengeprüft ist der Inhalt aber weiterhin nicht – behandelt insbesondere Zahlenwerte und die inhaltlichen Bewertungen also bitte mit entsprechender Vorsicht und nagelt mich auf nichts davon fest – die Dokumente sollen nur illustrieren, wohin die Reise gehen könnte. Der Vollständigkeit halber: Auch diese Mail ist zu Teilen mit Claude Code entstanden – ihr merkt, ich teste gerade ziemlich konsequent, wo das Tool hilft und wo nicht, und bin ehrlich neugierig, was ihr von der Qualität der Ergebnisse haltet.</w:t>
+          <w:b/>
+          <w:bCs/>
+          <w:sz w:val="22"/>
+          <w:szCs w:val="22"/>
+        </w:rPr>
+        <w:t xml:space="preserve">, </w:t>
+      </w:r>
+      <w:r>
+        <w:rPr>
+          <w:rFonts w:ascii="Arial" w:hAnsi="Arial" w:cs="Arial"/>
+          <w:b/>
+          <w:bCs/>
+          <w:sz w:val="22"/>
+          <w:szCs w:val="22"/>
+        </w:rPr>
+        <w:t xml:space="preserve">La</w:t>
+      </w:r>
+      <w:r>
+        <w:rPr>
+          <w:rFonts w:ascii="Arial" w:hAnsi="Arial" w:cs="Arial"/>
+          <w:b/>
+          <w:bCs/>
+          <w:sz w:val="22"/>
+          <w:szCs w:val="22"/>
+          <w:vertAlign w:val="subscript"/>
+        </w:rPr>
+        <w:t xml:space="preserve">1-x</w:t>
+      </w:r>
+      <w:r>
+        <w:rPr>
+          <w:rFonts w:ascii="Arial" w:hAnsi="Arial" w:cs="Arial"/>
+          <w:b/>
+          <w:bCs/>
+          <w:sz w:val="22"/>
+          <w:szCs w:val="22"/>
+        </w:rPr>
+        <w:t xml:space="preserve">Sr</w:t>
+      </w:r>
+      <w:r>
+        <w:rPr>
+          <w:rFonts w:ascii="Arial" w:hAnsi="Arial" w:cs="Arial"/>
+          <w:b/>
+          <w:bCs/>
+          <w:sz w:val="22"/>
+          <w:szCs w:val="22"/>
+          <w:vertAlign w:val="subscript"/>
+        </w:rPr>
+        <w:t xml:space="preserve">x</w:t>
+      </w:r>
+      <w:r>
+        <w:rPr>
+          <w:rFonts w:ascii="Arial" w:hAnsi="Arial" w:cs="Arial"/>
+          <w:b/>
+          <w:bCs/>
+          <w:sz w:val="22"/>
+          <w:szCs w:val="22"/>
+        </w:rPr>
+        <w:t xml:space="preserve">CoO</w:t>
+      </w:r>
+      <w:r>
+        <w:rPr>
+          <w:rFonts w:ascii="Arial" w:hAnsi="Arial" w:cs="Arial"/>
+          <w:b/>
+          <w:bCs/>
+          <w:sz w:val="22"/>
+          <w:szCs w:val="22"/>
+          <w:vertAlign w:val="subscript"/>
+        </w:rPr>
+        <w:t xml:space="preserve">3-δ</w:t>
+      </w:r>
+      <w:r>
+        <w:rPr>
+          <w:rFonts w:ascii="Arial" w:hAnsi="Arial" w:cs="Arial"/>
+          <w:b/>
+          <w:bCs/>
+          <w:sz w:val="22"/>
+          <w:szCs w:val="22"/>
+        </w:rPr>
+        <w:t xml:space="preserve"> (mit </w:t>
+      </w:r>
+      <w:r>
+        <w:rPr>
+          <w:rFonts w:ascii="Arial" w:hAnsi="Arial" w:cs="Arial"/>
+          <w:b/>
+          <w:bCs/>
+          <w:sz w:val="22"/>
+          <w:szCs w:val="22"/>
+        </w:rPr>
+        <w:t xml:space="preserve">SrCoO</w:t>
+      </w:r>
+      <w:r>
+        <w:rPr>
+          <w:rFonts w:ascii="Arial" w:hAnsi="Arial" w:cs="Arial"/>
+          <w:b/>
+          <w:bCs/>
+          <w:sz w:val="22"/>
+          <w:szCs w:val="22"/>
+          <w:vertAlign w:val="subscript"/>
+        </w:rPr>
+        <w:t xml:space="preserve">x</w:t>
+      </w:r>
+      <w:r>
+        <w:rPr>
+          <w:rFonts w:ascii="Arial" w:hAnsi="Arial" w:cs="Arial"/>
+          <w:b/>
+          <w:bCs/>
+          <w:sz w:val="22"/>
+          <w:szCs w:val="22"/>
+        </w:rPr>
+        <w:t xml:space="preserve">-Anker), </w:t>
+      </w:r>
+      <w:r>
+        <w:rPr>
+          <w:rFonts w:ascii="Arial" w:hAnsi="Arial" w:cs="Arial"/>
+          <w:b/>
+          <w:bCs/>
+          <w:sz w:val="22"/>
+          <w:szCs w:val="22"/>
+        </w:rPr>
+        <w:t xml:space="preserve">YBa</w:t>
+      </w:r>
+      <w:r>
+        <w:rPr>
+          <w:rFonts w:ascii="Arial" w:hAnsi="Arial" w:cs="Arial"/>
+          <w:b/>
+          <w:bCs/>
+          <w:sz w:val="22"/>
+          <w:szCs w:val="22"/>
+          <w:vertAlign w:val="subscript"/>
+        </w:rPr>
+        <w:t xml:space="preserve">2</w:t>
+      </w:r>
+      <w:r>
+        <w:rPr>
+          <w:rFonts w:ascii="Arial" w:hAnsi="Arial" w:cs="Arial"/>
+          <w:b/>
+          <w:bCs/>
+          <w:sz w:val="22"/>
+          <w:szCs w:val="22"/>
+        </w:rPr>
+        <w:t xml:space="preserve">Cu</w:t>
+      </w:r>
+      <w:r>
+        <w:rPr>
+          <w:rFonts w:ascii="Arial" w:hAnsi="Arial" w:cs="Arial"/>
+          <w:b/>
+          <w:bCs/>
+          <w:sz w:val="22"/>
+          <w:szCs w:val="22"/>
+          <w:vertAlign w:val="subscript"/>
+        </w:rPr>
+        <w:t xml:space="preserve">3</w:t>
+      </w:r>
+      <w:r>
+        <w:rPr>
+          <w:rFonts w:ascii="Arial" w:hAnsi="Arial" w:cs="Arial"/>
+          <w:b/>
+          <w:bCs/>
+          <w:sz w:val="22"/>
+          <w:szCs w:val="22"/>
+        </w:rPr>
+        <w:t xml:space="preserve">O</w:t>
+      </w:r>
+      <w:r>
+        <w:rPr>
+          <w:rFonts w:ascii="Arial" w:hAnsi="Arial" w:cs="Arial"/>
+          <w:b/>
+          <w:bCs/>
+          <w:sz w:val="22"/>
+          <w:szCs w:val="22"/>
+          <w:vertAlign w:val="subscript"/>
+        </w:rPr>
+        <w:t xml:space="preserve">7-δ</w:t>
+      </w:r>
+      <w:r>
+        <w:rPr>
+          <w:rFonts w:ascii="Arial" w:hAnsi="Arial" w:cs="Arial"/>
+          <w:b/>
+          <w:bCs/>
+          <w:sz w:val="22"/>
+          <w:szCs w:val="22"/>
+        </w:rPr>
+        <w:t xml:space="preserve"> und Gd-dotiertes </w:t>
+      </w:r>
+      <w:r>
+        <w:rPr>
+          <w:rFonts w:ascii="Arial" w:hAnsi="Arial" w:cs="Arial"/>
+          <w:b/>
+          <w:bCs/>
+          <w:sz w:val="22"/>
+          <w:szCs w:val="22"/>
+        </w:rPr>
+        <w:t xml:space="preserve">CeO</w:t>
+      </w:r>
+      <w:r>
+        <w:rPr>
+          <w:rFonts w:ascii="Arial" w:hAnsi="Arial" w:cs="Arial"/>
+          <w:b/>
+          <w:bCs/>
+          <w:sz w:val="22"/>
+          <w:szCs w:val="22"/>
+          <w:vertAlign w:val="subscript"/>
+        </w:rPr>
+        <w:t xml:space="preserve">2</w:t>
+      </w:r>
+      <w:r>
+        <w:rPr>
+          <w:rFonts w:ascii="Arial" w:hAnsi="Arial" w:cs="Arial"/>
+          <w:b/>
+          <w:bCs/>
+          <w:sz w:val="22"/>
+          <w:szCs w:val="22"/>
+        </w:rPr>
+        <w:t xml:space="preserve"> – mit je einem kompletten Antragsset (Feodor Lynen, Emmy Noether, ERC Starting Grant). Die Auswahl folgt einer strikten Drei-Kriterien-Beleglogik (Kovalenzänderung mit der Stöchiometrie per XAS belegt; Änderung der Leerstellen-Bildungsenergie mit der Kovalenz belegt; resistives Schalten an einer Edelmetall-Grenzfläche nachgewiesen), alle Literaturverweise sind einzeln gegen die Verlagsangaben verifiziert, und die ERC-/Emmy-Noether-Fassungen benennen vorgeprüfte Blind-Validierungskandidaten für die „Landkarten“-Idee. Details in der angehängten Vergleichsübersicht, der Literaturprüfung und dem Screening-Dokument; die einzelnen Antragssets schicke ich gerne nach, oder wir schauen sie gemeinsam durch. Von mir persönlich gegengeprüft ist der Inhalt aber nicht – behandelt Zahlenwerte und Bewertungen bitte mit entsprechender Vorsicht und nagelt mich auf nichts davon fest; die Dokumente sollen nur illustrieren, wohin die Reise gehen könnte.</w:t>
       </w:r>
     </w:p>
     <w:p>

</xml_diff>